<commit_message>
docs: Adicionando imagens a ativ1 e repo
</commit_message>
<xml_diff>
--- a/atv01/01-Leonardo_Cortes_Filho.docx
+++ b/atv01/01-Leonardo_Cortes_Filho.docx
@@ -161,6 +161,69 @@
           <w:sz w:val="20"/>
           <w:szCs w:val="20"/>
         </w:rPr>
+        <w:t>Sistema composto:</w:t>
+      </w:r>
+    </w:p>
+    <w:p>
+      <w:pPr>
+        <w:pStyle w:val="Normal"/>
+        <w:rPr>
+          <w:rFonts w:ascii="Arial" w:hAnsi="Arial"/>
+        </w:rPr>
+      </w:pPr>
+      <w:r>
+        <w:drawing>
+          <wp:anchor behindDoc="0" distT="0" distB="0" distL="0" distR="0" simplePos="0" locked="0" layoutInCell="0" allowOverlap="1" relativeHeight="3">
+            <wp:simplePos x="0" y="0"/>
+            <wp:positionH relativeFrom="column">
+              <wp:align>center</wp:align>
+            </wp:positionH>
+            <wp:positionV relativeFrom="paragraph">
+              <wp:posOffset>635</wp:posOffset>
+            </wp:positionV>
+            <wp:extent cx="3676650" cy="1724025"/>
+            <wp:effectExtent l="0" t="0" r="0" b="0"/>
+            <wp:wrapTopAndBottom/>
+            <wp:docPr id="1" name="Image2" descr=""/>
+            <wp:cNvGraphicFramePr>
+              <a:graphicFrameLocks xmlns:a="http://schemas.openxmlformats.org/drawingml/2006/main" noChangeAspect="1"/>
+            </wp:cNvGraphicFramePr>
+            <a:graphic xmlns:a="http://schemas.openxmlformats.org/drawingml/2006/main">
+              <a:graphicData uri="http://schemas.openxmlformats.org/drawingml/2006/picture">
+                <pic:pic xmlns:pic="http://schemas.openxmlformats.org/drawingml/2006/picture">
+                  <pic:nvPicPr>
+                    <pic:cNvPr id="1" name="Image2" descr=""/>
+                    <pic:cNvPicPr>
+                      <a:picLocks noChangeAspect="1" noChangeArrowheads="1"/>
+                    </pic:cNvPicPr>
+                  </pic:nvPicPr>
+                  <pic:blipFill>
+                    <a:blip r:embed="rId3"/>
+                    <a:stretch>
+                      <a:fillRect/>
+                    </a:stretch>
+                  </pic:blipFill>
+                  <pic:spPr bwMode="auto">
+                    <a:xfrm>
+                      <a:off x="0" y="0"/>
+                      <a:ext cx="3676650" cy="1724025"/>
+                    </a:xfrm>
+                    <a:prstGeom prst="rect">
+                      <a:avLst/>
+                    </a:prstGeom>
+                  </pic:spPr>
+                </pic:pic>
+              </a:graphicData>
+            </a:graphic>
+          </wp:anchor>
+        </w:drawing>
+      </w:r>
+      <w:r>
+        <w:rPr>
+          <w:rFonts w:cs="Arial" w:ascii="Arial" w:hAnsi="Arial"/>
+          <w:sz w:val="20"/>
+          <w:szCs w:val="20"/>
+        </w:rPr>
         <w:t>RAG (na minha perspectiva): Uma técnica que involve a busca de informação em uma base de dados (banco de dados, pasta, arquivo, etc) de acordo com a query recebida e informação recebida nessa busca, ou a falta, é utilizada como contexto para a resposta final.</w:t>
       </w:r>
     </w:p>
@@ -193,6 +256,85 @@
           <w:sz w:val="20"/>
           <w:szCs w:val="20"/>
         </w:rPr>
+        <w:t>Agente ReAct:</w:t>
+      </w:r>
+    </w:p>
+    <w:p>
+      <w:pPr>
+        <w:pStyle w:val="Normal"/>
+        <w:rPr>
+          <w:rFonts w:ascii="Arial" w:hAnsi="Arial"/>
+        </w:rPr>
+      </w:pPr>
+      <w:r>
+        <w:drawing>
+          <wp:anchor behindDoc="0" distT="0" distB="0" distL="0" distR="0" simplePos="0" locked="0" layoutInCell="0" allowOverlap="1" relativeHeight="2">
+            <wp:simplePos x="0" y="0"/>
+            <wp:positionH relativeFrom="column">
+              <wp:align>center</wp:align>
+            </wp:positionH>
+            <wp:positionV relativeFrom="paragraph">
+              <wp:posOffset>635</wp:posOffset>
+            </wp:positionV>
+            <wp:extent cx="3200400" cy="2962275"/>
+            <wp:effectExtent l="0" t="0" r="0" b="0"/>
+            <wp:wrapTopAndBottom/>
+            <wp:docPr id="2" name="Image1" descr=""/>
+            <wp:cNvGraphicFramePr>
+              <a:graphicFrameLocks xmlns:a="http://schemas.openxmlformats.org/drawingml/2006/main" noChangeAspect="1"/>
+            </wp:cNvGraphicFramePr>
+            <a:graphic xmlns:a="http://schemas.openxmlformats.org/drawingml/2006/main">
+              <a:graphicData uri="http://schemas.openxmlformats.org/drawingml/2006/picture">
+                <pic:pic xmlns:pic="http://schemas.openxmlformats.org/drawingml/2006/picture">
+                  <pic:nvPicPr>
+                    <pic:cNvPr id="2" name="Image1" descr=""/>
+                    <pic:cNvPicPr>
+                      <a:picLocks noChangeAspect="1" noChangeArrowheads="1"/>
+                    </pic:cNvPicPr>
+                  </pic:nvPicPr>
+                  <pic:blipFill>
+                    <a:blip r:embed="rId4"/>
+                    <a:stretch>
+                      <a:fillRect/>
+                    </a:stretch>
+                  </pic:blipFill>
+                  <pic:spPr bwMode="auto">
+                    <a:xfrm>
+                      <a:off x="0" y="0"/>
+                      <a:ext cx="3200400" cy="2962275"/>
+                    </a:xfrm>
+                    <a:prstGeom prst="rect">
+                      <a:avLst/>
+                    </a:prstGeom>
+                  </pic:spPr>
+                </pic:pic>
+              </a:graphicData>
+            </a:graphic>
+          </wp:anchor>
+        </w:drawing>
+      </w:r>
+      <w:r>
+        <w:rPr>
+          <w:rFonts w:cs="Arial" w:ascii="Arial" w:hAnsi="Arial"/>
+          <w:sz w:val="20"/>
+          <w:szCs w:val="20"/>
+        </w:rPr>
+        <w:t>O sistema seria o mesmo da primeira imagem, mas no lugar do modelo simples apenas recebendo a informação e respondendo imediatamente o agente raciocina iterativamente até uma resposta satisfatória ou o máximo de iterações.</w:t>
+      </w:r>
+    </w:p>
+    <w:p>
+      <w:pPr>
+        <w:pStyle w:val="Normal"/>
+        <w:rPr>
+          <w:rFonts w:ascii="Arial" w:hAnsi="Arial"/>
+        </w:rPr>
+      </w:pPr>
+      <w:r>
+        <w:rPr>
+          <w:rFonts w:cs="Arial" w:ascii="Arial" w:hAnsi="Arial"/>
+          <w:sz w:val="20"/>
+          <w:szCs w:val="20"/>
+        </w:rPr>
         <w:t>Vídeo 2:</w:t>
       </w:r>
     </w:p>
@@ -233,12 +375,79 @@
         <w:pStyle w:val="Normal"/>
         <w:rPr>
           <w:rFonts w:ascii="Arial" w:hAnsi="Arial"/>
-        </w:rPr>
-      </w:pPr>
-      <w:r>
-        <w:rPr>
-          <w:rFonts w:ascii="Arial" w:hAnsi="Arial"/>
-        </w:rPr>
+          <w:sz w:val="20"/>
+          <w:szCs w:val="20"/>
+        </w:rPr>
+      </w:pPr>
+      <w:r>
+        <w:rPr>
+          <w:rFonts w:ascii="Arial" w:hAnsi="Arial"/>
+          <w:sz w:val="20"/>
+          <w:szCs w:val="20"/>
+        </w:rPr>
+        <w:t>Exemplo de um sistema multiagente simples:</w:t>
+      </w:r>
+    </w:p>
+    <w:p>
+      <w:pPr>
+        <w:pStyle w:val="Normal"/>
+        <w:rPr>
+          <w:rFonts w:ascii="Arial" w:hAnsi="Arial"/>
+          <w:sz w:val="20"/>
+          <w:szCs w:val="20"/>
+        </w:rPr>
+      </w:pPr>
+      <w:r>
+        <w:rPr>
+          <w:rFonts w:ascii="Arial" w:hAnsi="Arial"/>
+          <w:sz w:val="20"/>
+          <w:szCs w:val="20"/>
+        </w:rPr>
+        <w:drawing>
+          <wp:anchor behindDoc="0" distT="0" distB="0" distL="0" distR="0" simplePos="0" locked="0" layoutInCell="0" allowOverlap="1" relativeHeight="4">
+            <wp:simplePos x="0" y="0"/>
+            <wp:positionH relativeFrom="column">
+              <wp:align>center</wp:align>
+            </wp:positionH>
+            <wp:positionV relativeFrom="paragraph">
+              <wp:posOffset>635</wp:posOffset>
+            </wp:positionV>
+            <wp:extent cx="4914900" cy="2019300"/>
+            <wp:effectExtent l="0" t="0" r="0" b="0"/>
+            <wp:wrapTopAndBottom/>
+            <wp:docPr id="3" name="Image3" descr=""/>
+            <wp:cNvGraphicFramePr>
+              <a:graphicFrameLocks xmlns:a="http://schemas.openxmlformats.org/drawingml/2006/main" noChangeAspect="1"/>
+            </wp:cNvGraphicFramePr>
+            <a:graphic xmlns:a="http://schemas.openxmlformats.org/drawingml/2006/main">
+              <a:graphicData uri="http://schemas.openxmlformats.org/drawingml/2006/picture">
+                <pic:pic xmlns:pic="http://schemas.openxmlformats.org/drawingml/2006/picture">
+                  <pic:nvPicPr>
+                    <pic:cNvPr id="3" name="Image3" descr=""/>
+                    <pic:cNvPicPr>
+                      <a:picLocks noChangeAspect="1" noChangeArrowheads="1"/>
+                    </pic:cNvPicPr>
+                  </pic:nvPicPr>
+                  <pic:blipFill>
+                    <a:blip r:embed="rId5"/>
+                    <a:stretch>
+                      <a:fillRect/>
+                    </a:stretch>
+                  </pic:blipFill>
+                  <pic:spPr bwMode="auto">
+                    <a:xfrm>
+                      <a:off x="0" y="0"/>
+                      <a:ext cx="4914900" cy="2019300"/>
+                    </a:xfrm>
+                    <a:prstGeom prst="rect">
+                      <a:avLst/>
+                    </a:prstGeom>
+                  </pic:spPr>
+                </pic:pic>
+              </a:graphicData>
+            </a:graphic>
+          </wp:anchor>
+        </w:drawing>
       </w:r>
     </w:p>
     <w:p>

</xml_diff>